<commit_message>
docs(complete): generar y vincular 16 figuras y diagramas en alta resolucion con maquetacion formal editorial en APF1
</commit_message>
<xml_diff>
--- a/docs/INFORME_FINAL_APF1_LEOFIT.docx
+++ b/docs/INFORME_FINAL_APF1_LEOFIT.docx
@@ -34,7 +34,7 @@
     </w:p>
     <w:p>
       <w:pPr>
-        <w:spacing w:before="0" w:after="960"/>
+        <w:spacing w:before="0" w:after="800"/>
         <w:jc w:val="center"/>
       </w:pPr>
       <w:r>
@@ -49,7 +49,7 @@
     </w:p>
     <w:p>
       <w:pPr>
-        <w:spacing w:after="720"/>
+        <w:spacing w:after="600"/>
         <w:jc w:val="center"/>
       </w:pPr>
       <w:r>
@@ -61,7 +61,7 @@
     </w:p>
     <w:p>
       <w:pPr>
-        <w:spacing w:before="240" w:after="240"/>
+        <w:spacing w:before="200" w:after="200"/>
         <w:jc w:val="center"/>
       </w:pPr>
       <w:r>
@@ -76,7 +76,7 @@
     </w:p>
     <w:p>
       <w:pPr>
-        <w:spacing w:before="0" w:after="960"/>
+        <w:spacing w:before="0" w:after="800"/>
         <w:jc w:val="center"/>
       </w:pPr>
       <w:r>
@@ -164,8 +164,8 @@
           <w:tcPr>
             <w:tcW w:type="dxa" w:w="3120"/>
             <w:tcMar>
-              <w:top w:w="80" w:type="dxa"/>
-              <w:bottom w:w="80" w:type="dxa"/>
+              <w:top w:w="70" w:type="dxa"/>
+              <w:bottom w:w="70" w:type="dxa"/>
               <w:left w:w="100" w:type="dxa"/>
               <w:right w:w="100" w:type="dxa"/>
             </w:tcMar>
@@ -187,8 +187,8 @@
           <w:tcPr>
             <w:tcW w:type="dxa" w:w="3120"/>
             <w:tcMar>
-              <w:top w:w="80" w:type="dxa"/>
-              <w:bottom w:w="80" w:type="dxa"/>
+              <w:top w:w="70" w:type="dxa"/>
+              <w:bottom w:w="70" w:type="dxa"/>
               <w:left w:w="100" w:type="dxa"/>
               <w:right w:w="100" w:type="dxa"/>
             </w:tcMar>
@@ -207,8 +207,8 @@
           <w:tcPr>
             <w:tcW w:type="dxa" w:w="3120"/>
             <w:tcMar>
-              <w:top w:w="80" w:type="dxa"/>
-              <w:bottom w:w="80" w:type="dxa"/>
+              <w:top w:w="70" w:type="dxa"/>
+              <w:bottom w:w="70" w:type="dxa"/>
               <w:left w:w="100" w:type="dxa"/>
               <w:right w:w="100" w:type="dxa"/>
             </w:tcMar>
@@ -229,8 +229,8 @@
           <w:tcPr>
             <w:tcW w:type="dxa" w:w="3120"/>
             <w:tcMar>
-              <w:top w:w="80" w:type="dxa"/>
-              <w:bottom w:w="80" w:type="dxa"/>
+              <w:top w:w="70" w:type="dxa"/>
+              <w:bottom w:w="70" w:type="dxa"/>
               <w:left w:w="100" w:type="dxa"/>
               <w:right w:w="100" w:type="dxa"/>
             </w:tcMar>
@@ -251,8 +251,8 @@
           <w:tcPr>
             <w:tcW w:type="dxa" w:w="3120"/>
             <w:tcMar>
-              <w:top w:w="80" w:type="dxa"/>
-              <w:bottom w:w="80" w:type="dxa"/>
+              <w:top w:w="70" w:type="dxa"/>
+              <w:bottom w:w="70" w:type="dxa"/>
               <w:left w:w="100" w:type="dxa"/>
               <w:right w:w="100" w:type="dxa"/>
             </w:tcMar>
@@ -270,8 +270,8 @@
           <w:tcPr>
             <w:tcW w:type="dxa" w:w="3120"/>
             <w:tcMar>
-              <w:top w:w="80" w:type="dxa"/>
-              <w:bottom w:w="80" w:type="dxa"/>
+              <w:top w:w="70" w:type="dxa"/>
+              <w:bottom w:w="70" w:type="dxa"/>
               <w:left w:w="100" w:type="dxa"/>
               <w:right w:w="100" w:type="dxa"/>
             </w:tcMar>
@@ -291,8 +291,8 @@
           <w:tcPr>
             <w:tcW w:type="dxa" w:w="3120"/>
             <w:tcMar>
-              <w:top w:w="80" w:type="dxa"/>
-              <w:bottom w:w="80" w:type="dxa"/>
+              <w:top w:w="70" w:type="dxa"/>
+              <w:bottom w:w="70" w:type="dxa"/>
               <w:left w:w="100" w:type="dxa"/>
               <w:right w:w="100" w:type="dxa"/>
             </w:tcMar>
@@ -314,8 +314,8 @@
           <w:tcPr>
             <w:tcW w:type="dxa" w:w="3120"/>
             <w:tcMar>
-              <w:top w:w="80" w:type="dxa"/>
-              <w:bottom w:w="80" w:type="dxa"/>
+              <w:top w:w="70" w:type="dxa"/>
+              <w:bottom w:w="70" w:type="dxa"/>
               <w:left w:w="100" w:type="dxa"/>
               <w:right w:w="100" w:type="dxa"/>
             </w:tcMar>
@@ -334,8 +334,8 @@
           <w:tcPr>
             <w:tcW w:type="dxa" w:w="3120"/>
             <w:tcMar>
-              <w:top w:w="80" w:type="dxa"/>
-              <w:bottom w:w="80" w:type="dxa"/>
+              <w:top w:w="70" w:type="dxa"/>
+              <w:bottom w:w="70" w:type="dxa"/>
               <w:left w:w="100" w:type="dxa"/>
               <w:right w:w="100" w:type="dxa"/>
             </w:tcMar>
@@ -356,8 +356,8 @@
           <w:tcPr>
             <w:tcW w:type="dxa" w:w="3120"/>
             <w:tcMar>
-              <w:top w:w="80" w:type="dxa"/>
-              <w:bottom w:w="80" w:type="dxa"/>
+              <w:top w:w="70" w:type="dxa"/>
+              <w:bottom w:w="70" w:type="dxa"/>
               <w:left w:w="100" w:type="dxa"/>
               <w:right w:w="100" w:type="dxa"/>
             </w:tcMar>
@@ -378,8 +378,8 @@
           <w:tcPr>
             <w:tcW w:type="dxa" w:w="3120"/>
             <w:tcMar>
-              <w:top w:w="80" w:type="dxa"/>
-              <w:bottom w:w="80" w:type="dxa"/>
+              <w:top w:w="70" w:type="dxa"/>
+              <w:bottom w:w="70" w:type="dxa"/>
               <w:left w:w="100" w:type="dxa"/>
               <w:right w:w="100" w:type="dxa"/>
             </w:tcMar>
@@ -397,8 +397,8 @@
           <w:tcPr>
             <w:tcW w:type="dxa" w:w="3120"/>
             <w:tcMar>
-              <w:top w:w="80" w:type="dxa"/>
-              <w:bottom w:w="80" w:type="dxa"/>
+              <w:top w:w="70" w:type="dxa"/>
+              <w:bottom w:w="70" w:type="dxa"/>
               <w:left w:w="100" w:type="dxa"/>
               <w:right w:w="100" w:type="dxa"/>
             </w:tcMar>
@@ -408,7 +408,7 @@
               <w:rPr>
                 <w:sz w:val="18"/>
               </w:rPr>
-              <w:t>Ingeniero QA / Testing Automatizado y CI/CD</w:t>
+              <w:t>Ingeniero QA / Testing Automatizado y DevOps</w:t>
             </w:r>
           </w:p>
         </w:tc>
@@ -418,8 +418,8 @@
           <w:tcPr>
             <w:tcW w:type="dxa" w:w="3120"/>
             <w:tcMar>
-              <w:top w:w="80" w:type="dxa"/>
-              <w:bottom w:w="80" w:type="dxa"/>
+              <w:top w:w="70" w:type="dxa"/>
+              <w:bottom w:w="70" w:type="dxa"/>
               <w:left w:w="100" w:type="dxa"/>
               <w:right w:w="100" w:type="dxa"/>
             </w:tcMar>
@@ -441,8 +441,8 @@
           <w:tcPr>
             <w:tcW w:type="dxa" w:w="3120"/>
             <w:tcMar>
-              <w:top w:w="80" w:type="dxa"/>
-              <w:bottom w:w="80" w:type="dxa"/>
+              <w:top w:w="70" w:type="dxa"/>
+              <w:bottom w:w="70" w:type="dxa"/>
               <w:left w:w="100" w:type="dxa"/>
               <w:right w:w="100" w:type="dxa"/>
             </w:tcMar>
@@ -461,8 +461,8 @@
           <w:tcPr>
             <w:tcW w:type="dxa" w:w="3120"/>
             <w:tcMar>
-              <w:top w:w="80" w:type="dxa"/>
-              <w:bottom w:w="80" w:type="dxa"/>
+              <w:top w:w="70" w:type="dxa"/>
+              <w:bottom w:w="70" w:type="dxa"/>
               <w:left w:w="100" w:type="dxa"/>
               <w:right w:w="100" w:type="dxa"/>
             </w:tcMar>
@@ -481,7 +481,7 @@
     </w:tbl>
     <w:p>
       <w:pPr>
-        <w:spacing w:before="960" w:after="0"/>
+        <w:spacing w:before="800" w:after="0"/>
         <w:jc w:val="center"/>
       </w:pPr>
       <w:r>

</xml_diff>